<commit_message>
Replace all LaTeX math symbols with clean Unicode symbols (≤, ≥, →, >, <) in HTML, Markdown, and DOCX
</commit_message>
<xml_diff>
--- a/20261019_0908_terra_nova/20261019_0908_Terra_Nova_Audio_Report.docx
+++ b/20261019_0908_terra_nova/20261019_0908_Terra_Nova_Audio_Report.docx
@@ -8676,7 +8676,27 @@
           <w:sz w:val="21"/>
           <w:szCs w:val="21"/>
         </w:rPr>
-        <w:t xml:space="preserve">R15（內半徑 15 mm，即 15/6 = \mathbf{2.5t}）</w:t>
+        <w:t xml:space="preserve">R15（內半徑 15 mm，即 15/6 = </w:t>
+      </w:r>
+      <w:r>
+        <w:rPr>
+          <w:rFonts w:ascii="Calibri" w:hAnsi="Calibri" w:eastAsia="Microsoft JhengHei" w:cs="Calibri"/>
+          <w:color w:val="1E293B"/>
+          <w:sz w:val="21"/>
+          <w:szCs w:val="21"/>
+        </w:rPr>
+        <w:t xml:space="preserve">2.5t</w:t>
+      </w:r>
+      <w:r>
+        <w:rPr>
+          <w:rFonts w:ascii="Calibri" w:hAnsi="Calibri" w:eastAsia="Microsoft JhengHei" w:cs="Calibri"/>
+          <w:b/>
+          <w:bCs/>
+          <w:color w:val="1E293B"/>
+          <w:sz w:val="21"/>
+          <w:szCs w:val="21"/>
+        </w:rPr>
+        <w:t xml:space="preserve">）</w:t>
       </w:r>
       <w:r>
         <w:rPr>

</xml_diff>